<commit_message>
feat(templates): remove weight column from sample templates and exports for simplicity
</commit_message>
<xml_diff>
--- a/src/arminer/templates/sample_templates/mau_tu_dien_arminer.docx
+++ b/src/arminer/templates/sample_templates/mau_tu_dien_arminer.docx
@@ -23,21 +23,21 @@
         <w:rPr>
           <w:b/>
         </w:rPr>
-        <w:t>Hướng dẫn:</w:t>
+        <w:t>Hướng dẫn thực hiện đơn giản:</w:t>
         <w:br/>
       </w:r>
       <w:r>
-        <w:t>1. Bạn có thể điền danh sách từ khóa vào Bảng bên dưới (rất dễ theo dõi).</w:t>
+        <w:t>1. Bạn có thể điền danh sách từ khóa vào Bảng bên dưới (rất dễ làm theo).</w:t>
         <w:br/>
-        <w:t>2. Cột 'Từ Khóa Chính' là bắt buộc. Các cột còn lại (Biến Thể, Nhóm, Trọng Số) có thể để trống nếu không dùng.</w:t>
+        <w:t>2. Cột 'Từ Khóa Chính' là bắt buộc. Các cột còn lại (Biến Thể, Nhóm) có thể để trống nếu không dùng.</w:t>
         <w:br/>
-        <w:t xml:space="preserve">3. Nếu không thích bảng, bạn cũng có thể gõ danh sách gạch đầu dòng dạng: </w:t>
+        <w:t xml:space="preserve">3. Nếu không thích bảng, bạn cũng có thể gõ danh sách tự do dạng: </w:t>
       </w:r>
       <w:r>
         <w:rPr>
           <w:i/>
         </w:rPr>
-        <w:t>từ khóa chính | từ đồng nghĩa | nhóm | trọng số</w:t>
+        <w:t>từ khóa chính | từ đồng nghĩa | nhóm</w:t>
       </w:r>
       <w:r>
         <w:t xml:space="preserve"> ở bất kỳ đâu trong tài liệu Word này, hệ thống arminer đều tự động nhận diện được!</w:t>
@@ -51,15 +51,14 @@
         <w:tblLook w:firstColumn="1" w:firstRow="1" w:lastColumn="0" w:lastRow="0" w:noHBand="0" w:noVBand="1" w:val="04A0"/>
       </w:tblPr>
       <w:tblGrid>
-        <w:gridCol w:w="2160"/>
-        <w:gridCol w:w="2160"/>
-        <w:gridCol w:w="2160"/>
-        <w:gridCol w:w="2160"/>
+        <w:gridCol w:w="2880"/>
+        <w:gridCol w:w="2880"/>
+        <w:gridCol w:w="2880"/>
       </w:tblGrid>
       <w:tr>
         <w:tc>
           <w:tcPr>
-            <w:tcW w:type="dxa" w:w="2160"/>
+            <w:tcW w:type="dxa" w:w="2880"/>
             <w:shd w:val="clear" w:color="auto" w:fill="1E3A8A"/>
           </w:tcPr>
           <w:p>
@@ -75,7 +74,7 @@
         </w:tc>
         <w:tc>
           <w:tcPr>
-            <w:tcW w:type="dxa" w:w="2160"/>
+            <w:tcW w:type="dxa" w:w="2880"/>
             <w:shd w:val="clear" w:color="auto" w:fill="1E3A8A"/>
           </w:tcPr>
           <w:p>
@@ -91,7 +90,7 @@
         </w:tc>
         <w:tc>
           <w:tcPr>
-            <w:tcW w:type="dxa" w:w="2160"/>
+            <w:tcW w:type="dxa" w:w="2880"/>
             <w:shd w:val="clear" w:color="auto" w:fill="1E3A8A"/>
           </w:tcPr>
           <w:p>
@@ -105,27 +104,11 @@
             </w:r>
           </w:p>
         </w:tc>
-        <w:tc>
-          <w:tcPr>
-            <w:tcW w:type="dxa" w:w="2160"/>
-            <w:shd w:val="clear" w:color="auto" w:fill="1E3A8A"/>
-          </w:tcPr>
-          <w:p>
-            <w:r>
-              <w:rPr>
-                <w:b/>
-                <w:color w:val="FFFFFF"/>
-                <w:sz w:val="20"/>
-              </w:rPr>
-              <w:t>Trọng Số</w:t>
-            </w:r>
-          </w:p>
-        </w:tc>
       </w:tr>
       <w:tr>
         <w:tc>
           <w:tcPr>
-            <w:tcW w:type="dxa" w:w="2160"/>
+            <w:tcW w:type="dxa" w:w="2880"/>
           </w:tcPr>
           <w:p>
             <w:r>
@@ -138,7 +121,7 @@
         </w:tc>
         <w:tc>
           <w:tcPr>
-            <w:tcW w:type="dxa" w:w="2160"/>
+            <w:tcW w:type="dxa" w:w="2880"/>
           </w:tcPr>
           <w:p>
             <w:r>
@@ -151,7 +134,7 @@
         </w:tc>
         <w:tc>
           <w:tcPr>
-            <w:tcW w:type="dxa" w:w="2160"/>
+            <w:tcW w:type="dxa" w:w="2880"/>
           </w:tcPr>
           <w:p>
             <w:r>
@@ -162,24 +145,11 @@
             </w:r>
           </w:p>
         </w:tc>
-        <w:tc>
-          <w:tcPr>
-            <w:tcW w:type="dxa" w:w="2160"/>
-          </w:tcPr>
-          <w:p>
-            <w:r>
-              <w:rPr>
-                <w:sz w:val="19"/>
-              </w:rPr>
-              <w:t>1.0</w:t>
-            </w:r>
-          </w:p>
-        </w:tc>
       </w:tr>
       <w:tr>
         <w:tc>
           <w:tcPr>
-            <w:tcW w:type="dxa" w:w="2160"/>
+            <w:tcW w:type="dxa" w:w="2880"/>
           </w:tcPr>
           <w:p>
             <w:r>
@@ -192,7 +162,7 @@
         </w:tc>
         <w:tc>
           <w:tcPr>
-            <w:tcW w:type="dxa" w:w="2160"/>
+            <w:tcW w:type="dxa" w:w="2880"/>
           </w:tcPr>
           <w:p>
             <w:r>
@@ -205,7 +175,7 @@
         </w:tc>
         <w:tc>
           <w:tcPr>
-            <w:tcW w:type="dxa" w:w="2160"/>
+            <w:tcW w:type="dxa" w:w="2880"/>
           </w:tcPr>
           <w:p>
             <w:r>
@@ -216,24 +186,11 @@
             </w:r>
           </w:p>
         </w:tc>
-        <w:tc>
-          <w:tcPr>
-            <w:tcW w:type="dxa" w:w="2160"/>
-          </w:tcPr>
-          <w:p>
-            <w:r>
-              <w:rPr>
-                <w:sz w:val="19"/>
-              </w:rPr>
-              <w:t>1.5</w:t>
-            </w:r>
-          </w:p>
-        </w:tc>
       </w:tr>
       <w:tr>
         <w:tc>
           <w:tcPr>
-            <w:tcW w:type="dxa" w:w="2160"/>
+            <w:tcW w:type="dxa" w:w="2880"/>
           </w:tcPr>
           <w:p>
             <w:r>
@@ -246,7 +203,7 @@
         </w:tc>
         <w:tc>
           <w:tcPr>
-            <w:tcW w:type="dxa" w:w="2160"/>
+            <w:tcW w:type="dxa" w:w="2880"/>
           </w:tcPr>
           <w:p>
             <w:r>
@@ -259,7 +216,7 @@
         </w:tc>
         <w:tc>
           <w:tcPr>
-            <w:tcW w:type="dxa" w:w="2160"/>
+            <w:tcW w:type="dxa" w:w="2880"/>
           </w:tcPr>
           <w:p>
             <w:r>
@@ -270,24 +227,11 @@
             </w:r>
           </w:p>
         </w:tc>
-        <w:tc>
-          <w:tcPr>
-            <w:tcW w:type="dxa" w:w="2160"/>
-          </w:tcPr>
-          <w:p>
-            <w:r>
-              <w:rPr>
-                <w:sz w:val="19"/>
-              </w:rPr>
-              <w:t>1.0</w:t>
-            </w:r>
-          </w:p>
-        </w:tc>
       </w:tr>
       <w:tr>
         <w:tc>
           <w:tcPr>
-            <w:tcW w:type="dxa" w:w="2160"/>
+            <w:tcW w:type="dxa" w:w="2880"/>
           </w:tcPr>
           <w:p>
             <w:r>
@@ -300,7 +244,7 @@
         </w:tc>
         <w:tc>
           <w:tcPr>
-            <w:tcW w:type="dxa" w:w="2160"/>
+            <w:tcW w:type="dxa" w:w="2880"/>
           </w:tcPr>
           <w:p>
             <w:r>
@@ -313,7 +257,7 @@
         </w:tc>
         <w:tc>
           <w:tcPr>
-            <w:tcW w:type="dxa" w:w="2160"/>
+            <w:tcW w:type="dxa" w:w="2880"/>
           </w:tcPr>
           <w:p>
             <w:r>
@@ -324,24 +268,11 @@
             </w:r>
           </w:p>
         </w:tc>
-        <w:tc>
-          <w:tcPr>
-            <w:tcW w:type="dxa" w:w="2160"/>
-          </w:tcPr>
-          <w:p>
-            <w:r>
-              <w:rPr>
-                <w:sz w:val="19"/>
-              </w:rPr>
-              <w:t>1.0</w:t>
-            </w:r>
-          </w:p>
-        </w:tc>
       </w:tr>
       <w:tr>
         <w:tc>
           <w:tcPr>
-            <w:tcW w:type="dxa" w:w="2160"/>
+            <w:tcW w:type="dxa" w:w="2880"/>
           </w:tcPr>
           <w:p>
             <w:r>
@@ -354,7 +285,7 @@
         </w:tc>
         <w:tc>
           <w:tcPr>
-            <w:tcW w:type="dxa" w:w="2160"/>
+            <w:tcW w:type="dxa" w:w="2880"/>
           </w:tcPr>
           <w:p>
             <w:r>
@@ -367,7 +298,7 @@
         </w:tc>
         <w:tc>
           <w:tcPr>
-            <w:tcW w:type="dxa" w:w="2160"/>
+            <w:tcW w:type="dxa" w:w="2880"/>
           </w:tcPr>
           <w:p>
             <w:r>
@@ -378,24 +309,11 @@
             </w:r>
           </w:p>
         </w:tc>
-        <w:tc>
-          <w:tcPr>
-            <w:tcW w:type="dxa" w:w="2160"/>
-          </w:tcPr>
-          <w:p>
-            <w:r>
-              <w:rPr>
-                <w:sz w:val="19"/>
-              </w:rPr>
-              <w:t>1.2</w:t>
-            </w:r>
-          </w:p>
-        </w:tc>
       </w:tr>
       <w:tr>
         <w:tc>
           <w:tcPr>
-            <w:tcW w:type="dxa" w:w="2160"/>
+            <w:tcW w:type="dxa" w:w="2880"/>
           </w:tcPr>
           <w:p>
             <w:r>
@@ -408,7 +326,7 @@
         </w:tc>
         <w:tc>
           <w:tcPr>
-            <w:tcW w:type="dxa" w:w="2160"/>
+            <w:tcW w:type="dxa" w:w="2880"/>
           </w:tcPr>
           <w:p>
             <w:r>
@@ -421,7 +339,7 @@
         </w:tc>
         <w:tc>
           <w:tcPr>
-            <w:tcW w:type="dxa" w:w="2160"/>
+            <w:tcW w:type="dxa" w:w="2880"/>
           </w:tcPr>
           <w:p>
             <w:r>
@@ -432,24 +350,11 @@
             </w:r>
           </w:p>
         </w:tc>
-        <w:tc>
-          <w:tcPr>
-            <w:tcW w:type="dxa" w:w="2160"/>
-          </w:tcPr>
-          <w:p>
-            <w:r>
-              <w:rPr>
-                <w:sz w:val="19"/>
-              </w:rPr>
-              <w:t>1.0</w:t>
-            </w:r>
-          </w:p>
-        </w:tc>
       </w:tr>
       <w:tr>
         <w:tc>
           <w:tcPr>
-            <w:tcW w:type="dxa" w:w="2160"/>
+            <w:tcW w:type="dxa" w:w="2880"/>
           </w:tcPr>
           <w:p>
             <w:r>
@@ -462,7 +367,7 @@
         </w:tc>
         <w:tc>
           <w:tcPr>
-            <w:tcW w:type="dxa" w:w="2160"/>
+            <w:tcW w:type="dxa" w:w="2880"/>
           </w:tcPr>
           <w:p>
             <w:r>
@@ -475,7 +380,7 @@
         </w:tc>
         <w:tc>
           <w:tcPr>
-            <w:tcW w:type="dxa" w:w="2160"/>
+            <w:tcW w:type="dxa" w:w="2880"/>
           </w:tcPr>
           <w:p>
             <w:r>
@@ -486,24 +391,11 @@
             </w:r>
           </w:p>
         </w:tc>
-        <w:tc>
-          <w:tcPr>
-            <w:tcW w:type="dxa" w:w="2160"/>
-          </w:tcPr>
-          <w:p>
-            <w:r>
-              <w:rPr>
-                <w:sz w:val="19"/>
-              </w:rPr>
-              <w:t>1.0</w:t>
-            </w:r>
-          </w:p>
-        </w:tc>
       </w:tr>
       <w:tr>
         <w:tc>
           <w:tcPr>
-            <w:tcW w:type="dxa" w:w="2160"/>
+            <w:tcW w:type="dxa" w:w="2880"/>
           </w:tcPr>
           <w:p>
             <w:r>
@@ -516,7 +408,7 @@
         </w:tc>
         <w:tc>
           <w:tcPr>
-            <w:tcW w:type="dxa" w:w="2160"/>
+            <w:tcW w:type="dxa" w:w="2880"/>
           </w:tcPr>
           <w:p>
             <w:r>
@@ -529,7 +421,7 @@
         </w:tc>
         <w:tc>
           <w:tcPr>
-            <w:tcW w:type="dxa" w:w="2160"/>
+            <w:tcW w:type="dxa" w:w="2880"/>
           </w:tcPr>
           <w:p>
             <w:r>
@@ -537,19 +429,6 @@
                 <w:sz w:val="19"/>
               </w:rPr>
               <w:t>MoiTruong</w:t>
-            </w:r>
-          </w:p>
-        </w:tc>
-        <w:tc>
-          <w:tcPr>
-            <w:tcW w:type="dxa" w:w="2160"/>
-          </w:tcPr>
-          <w:p>
-            <w:r>
-              <w:rPr>
-                <w:sz w:val="19"/>
-              </w:rPr>
-              <w:t>1.2</w:t>
             </w:r>
           </w:p>
         </w:tc>

</xml_diff>